<commit_message>
test: upgrade contract memory pack with review-gated workflows
</commit_message>
<xml_diff>
--- a/openharvey_contract_memory_pack/01_history/contracts_docx/H01_工业控制终端采购合同.docx
+++ b/openharvey_contract_memory_pack/01_history/contracts_docx/H01_工业控制终端采购合同.docx
@@ -12,7 +12,7 @@
     </w:p>
     <w:p>
       <w:r>
-        <w:t>合同编号 H01  |  草案日期 2026-01-12  |  项目 PRJ-PLANT-A</w:t>
+        <w:t>合同编号 HZ-CG-2026-001  |  草案日期 2026-01-12  |  项目 一期生产线终端采购项目</w:t>
       </w:r>
     </w:p>
     <w:p>
@@ -21,34 +21,26 @@
       </w:r>
     </w:p>
     <w:p>
+      <w:pPr>
+        <w:pStyle w:val="Heading1"/>
+        <w:keepNext/>
+      </w:pPr>
       <w:r>
-        <w:t>测试主体映射 甲方 ORG-HZ-001  乙方 ORG-QH-001</w:t>
+        <w:t>第1条 合同主体与交易目的</w:t>
       </w:r>
     </w:p>
     <w:p>
       <w:r>
-        <w:t>本文件为原创虚构合同草案，仅用于合同审批记忆评测；企业名称为测试标签，不指向真实登记主体。未签署，不能直接用于交易。</w:t>
+        <w:t>甲方为华子有限公司（买受人），乙方为启衡设备有限公司（出卖人）。甲方采购工业控制终端用于自有生产线，不包含软件定制开发。合同编号 HZ-CG-2026-001，履行项目为 一期生产线终端采购项目。双方应在签署前核验主体名称和授权文件。</w:t>
       </w:r>
     </w:p>
     <w:p>
       <w:pPr>
         <w:pStyle w:val="Heading1"/>
+        <w:keepNext/>
       </w:pPr>
       <w:r>
-        <w:t>第1条 合同主体与交易目的  H01-C01</w:t>
-      </w:r>
-    </w:p>
-    <w:p>
-      <w:r>
-        <w:t>甲方为华子有限公司（买受人），乙方为启衡设备有限公司（出卖人）。甲方采购工业控制终端用于自有生产线，不包含软件定制开发。合同编号 H01，履行项目为 PRJ-PLANT-A。双方主体映射见首页测试元数据。</w:t>
-      </w:r>
-    </w:p>
-    <w:p>
-      <w:pPr>
-        <w:pStyle w:val="Heading1"/>
-      </w:pPr>
-      <w:r>
-        <w:t>第2条 标的和合同价款  H01-C02</w:t>
+        <w:t>第2条 标的和合同价款</w:t>
       </w:r>
     </w:p>
     <w:p>
@@ -59,9 +51,10 @@
     <w:p>
       <w:pPr>
         <w:pStyle w:val="Heading1"/>
+        <w:keepNext/>
       </w:pPr>
       <w:r>
-        <w:t>第3条 技术质量与交付  H01-C03</w:t>
+        <w:t>第3条 技术质量与交付</w:t>
       </w:r>
     </w:p>
     <w:p>
@@ -72,9 +65,10 @@
     <w:p>
       <w:pPr>
         <w:pStyle w:val="Heading1"/>
+        <w:keepNext/>
       </w:pPr>
       <w:r>
-        <w:t>第4条 验收与质量保证  H01-C04</w:t>
+        <w:t>第4条 验收与质量保证</w:t>
       </w:r>
     </w:p>
     <w:p>
@@ -85,9 +79,10 @@
     <w:p>
       <w:pPr>
         <w:pStyle w:val="Heading1"/>
+        <w:keepNext/>
       </w:pPr>
       <w:r>
-        <w:t>第5条 付款安排  H01-C05</w:t>
+        <w:t>第5条 付款安排</w:t>
       </w:r>
     </w:p>
     <w:p>
@@ -98,9 +93,10 @@
     <w:p>
       <w:pPr>
         <w:pStyle w:val="Heading1"/>
+        <w:keepNext/>
       </w:pPr>
       <w:r>
-        <w:t>第6条 交付迟延责任  H01-C06</w:t>
+        <w:t>第6条 交付迟延责任</w:t>
       </w:r>
     </w:p>
     <w:p>
@@ -111,9 +107,10 @@
     <w:p>
       <w:pPr>
         <w:pStyle w:val="Heading1"/>
+        <w:keepNext/>
       </w:pPr>
       <w:r>
-        <w:t>第7条 责任边界  H01-C07</w:t>
+        <w:t>第7条 责任边界</w:t>
       </w:r>
     </w:p>
     <w:p>
@@ -124,9 +121,10 @@
     <w:p>
       <w:pPr>
         <w:pStyle w:val="Heading1"/>
+        <w:keepNext/>
       </w:pPr>
       <w:r>
-        <w:t>第8条 知识产权和资料  H01-C08</w:t>
+        <w:t>第8条 知识产权和资料</w:t>
       </w:r>
     </w:p>
     <w:p>
@@ -137,9 +135,10 @@
     <w:p>
       <w:pPr>
         <w:pStyle w:val="Heading1"/>
+        <w:keepNext/>
       </w:pPr>
       <w:r>
-        <w:t>第9条 保密义务  H01-C09</w:t>
+        <w:t>第9条 保密义务</w:t>
       </w:r>
     </w:p>
     <w:p>
@@ -150,9 +149,10 @@
     <w:p>
       <w:pPr>
         <w:pStyle w:val="Heading1"/>
+        <w:keepNext/>
       </w:pPr>
       <w:r>
-        <w:t>第10条 变更与解除  H01-C10</w:t>
+        <w:t>第10条 变更与解除</w:t>
       </w:r>
     </w:p>
     <w:p>
@@ -163,9 +163,10 @@
     <w:p>
       <w:pPr>
         <w:pStyle w:val="Heading1"/>
+        <w:keepNext/>
       </w:pPr>
       <w:r>
-        <w:t>第11条 不可抗力  H01-C11</w:t>
+        <w:t>第11条 不可抗力</w:t>
       </w:r>
     </w:p>
     <w:p>
@@ -176,22 +177,24 @@
     <w:p>
       <w:pPr>
         <w:pStyle w:val="Heading1"/>
+        <w:keepNext/>
       </w:pPr>
       <w:r>
-        <w:t>第12条 通知与账户  H01-C12</w:t>
+        <w:t>第12条 通知与账户</w:t>
       </w:r>
     </w:p>
     <w:p>
       <w:r>
-        <w:t>双方以本合同约定的项目书面记录交换通知；接收角色分别为各方项目负责人，法律通知同时送交各方法务。变更应由有权代表签署。为防止误用，本样本不提供真实地址、自然人、电话、印章或银行账号；正式签署前应另附经核验的主体、送达和账户清单。更改收款账户必须经付款方独立回拨核验，不以单封邮件为依据。</w:t>
+        <w:t>双方以本合同约定的项目书面记录交换通知；接收角色分别为各方项目负责人，法律通知同时送交各方法务。变更应由有权代表签署。双方的联系信息、送达地址及收款账户以经核验的书面清单为准，签署前由各方有权代表确认。更改收款账户必须经付款方独立回拨核验，不以单封邮件为依据。</w:t>
       </w:r>
     </w:p>
     <w:p>
       <w:pPr>
         <w:pStyle w:val="Heading1"/>
+        <w:keepNext/>
       </w:pPr>
       <w:r>
-        <w:t>第13条 争议解决  H01-C13</w:t>
+        <w:t>第13条 争议解决</w:t>
       </w:r>
     </w:p>
     <w:p>
@@ -202,43 +205,40 @@
     <w:p>
       <w:pPr>
         <w:pStyle w:val="Heading1"/>
+        <w:keepNext/>
       </w:pPr>
       <w:r>
-        <w:t>第14条 生效与签署  H01-C14</w:t>
+        <w:t>第14条 生效与签署</w:t>
       </w:r>
     </w:p>
     <w:p>
       <w:r>
-        <w:t>本合同适用中华人民共和国大陆地区法律。双方有权代表签字并加盖公章或合同专用章后生效；本测试文件未签署、未盖章，不代表现实法律承诺。修改、附件与补充协议应采用书面形式，冲突时以双方后签署且明确变更原条款的文件为准。合同一式两份，双方各执一份。甲方签署栏与乙方签署栏均留空；签署日期以真实签署时填写为准。</w:t>
+        <w:t>本合同适用中华人民共和国大陆地区法律。双方有权代表签字并加盖公章或合同专用章后生效。修改、附件与补充协议应采用书面形式，冲突时以双方后签署且明确变更原条款的文件为准。合同一式两份，双方各执一份。</w:t>
+      </w:r>
+    </w:p>
+    <w:p>
+      <w:r>
+        <w:t>甲方签章：________________    乙方签章：________________</w:t>
+      </w:r>
+    </w:p>
+    <w:p>
+      <w:r>
+        <w:t>授权代表：________________    授权代表：________________</w:t>
+      </w:r>
+    </w:p>
+    <w:p>
+      <w:r>
+        <w:t>签署日期：________________    签署日期：________________</w:t>
       </w:r>
     </w:p>
     <w:sectPr>
-      <w:footerReference w:type="default" r:id="rId9"/>
-      <w:pgSz w:w="12240" w:h="15840"/>
-      <w:pgMar w:top="1008" w:right="1181" w:bottom="979" w:left="1181" w:header="720" w:footer="720" w:gutter="0"/>
+      <w:pgSz w:w="11906" w:h="16838"/>
+      <w:pgMar w:top="1134" w:right="1191" w:bottom="1134" w:left="1191" w:header="720" w:footer="720" w:gutter="0"/>
       <w:cols w:space="720"/>
       <w:docGrid w:linePitch="360"/>
     </w:sectPr>
   </w:body>
 </w:document>
-</file>
-
-<file path=word/footer1.xml><?xml version="1.0" encoding="utf-8"?>
-<w:ftr xmlns:m="http://schemas.openxmlformats.org/officeDocument/2006/math" xmlns:mc="http://schemas.openxmlformats.org/markup-compatibility/2006" xmlns:mo="http://schemas.microsoft.com/office/mac/office/2008/main" xmlns:mv="urn:schemas-microsoft-com:mac:vml" xmlns:o="urn:schemas-microsoft-com:office:office" xmlns:r="http://schemas.openxmlformats.org/officeDocument/2006/relationships" xmlns:v="urn:schemas-microsoft-com:vml" xmlns:w10="urn:schemas-microsoft-com:office:word" xmlns:w14="http://schemas.microsoft.com/office/word/2010/wordml" xmlns:w="http://schemas.openxmlformats.org/wordprocessingml/2006/main" xmlns:wne="http://schemas.microsoft.com/office/word/2006/wordml" xmlns:wp14="http://schemas.microsoft.com/office/word/2010/wordprocessingDrawing" xmlns:wp="http://schemas.openxmlformats.org/drawingml/2006/wordprocessingDrawing" xmlns:wpc="http://schemas.microsoft.com/office/word/2010/wordprocessingCanvas" xmlns:wpg="http://schemas.microsoft.com/office/word/2010/wordprocessingGroup" xmlns:wpi="http://schemas.microsoft.com/office/word/2010/wordprocessingInk" xmlns:wps="http://schemas.microsoft.com/office/word/2010/wordprocessingShape" mc:Ignorable="w14 wp14">
-  <w:p>
-    <w:pPr>
-      <w:pStyle w:val="Footer"/>
-      <w:jc w:val="center"/>
-    </w:pPr>
-    <w:r>
-      <w:rPr>
-        <w:sz w:val="16"/>
-      </w:rPr>
-      <w:t xml:space="preserve">原创虚构评测样本  H01  |  非真实已签合同  |  </w:t>
-    </w:r>
-    <w:fldSimple w:instr="PAGE"/>
-  </w:p>
-</w:ftr>
 </file>
 
 <file path=word/numbering.xml><?xml version="1.0" encoding="utf-8"?>
@@ -605,10 +605,10 @@
     <w:qFormat/>
     <w:rsid w:val="00FC693F"/>
     <w:pPr>
-      <w:spacing w:line="283" w:lineRule="auto" w:after="80"/>
+      <w:spacing w:line="288" w:lineRule="auto" w:after="100"/>
     </w:pPr>
     <w:rPr>
-      <w:rFonts w:ascii="Noto Serif CJK SC" w:hAnsi="Noto Serif CJK SC" w:eastAsia="Noto Serif CJK SC"/>
+      <w:rFonts w:ascii="Arial Unicode MS" w:hAnsi="Arial Unicode MS" w:eastAsia="Arial Unicode MS" w:cs="Arial Unicode MS"/>
       <w:color w:val="000000"/>
       <w:sz w:val="21"/>
     </w:rPr>
@@ -668,15 +668,15 @@
     <w:pPr>
       <w:keepNext/>
       <w:keepLines/>
-      <w:spacing w:before="160" w:after="60"/>
+      <w:spacing w:before="480" w:after="0"/>
       <w:outlineLvl w:val="0"/>
     </w:pPr>
     <w:rPr>
-      <w:rFonts w:asciiTheme="majorHAnsi" w:eastAsiaTheme="majorEastAsia" w:hAnsiTheme="majorHAnsi" w:cstheme="majorBidi" w:ascii="Noto Serif CJK SC" w:hAnsi="Noto Serif CJK SC" w:eastAsia="Noto Serif CJK SC"/>
-      <w:b/>
+      <w:rFonts w:ascii="Arial Unicode MS" w:hAnsi="Arial Unicode MS" w:eastAsia="Arial Unicode MS" w:cs="Arial Unicode MS"/>
+      <w:b w:val="0"/>
       <w:bCs/>
       <w:color w:val="000000"/>
-      <w:sz w:val="23"/>
+      <w:sz w:val="24"/>
       <w:szCs w:val="28"/>
     </w:rPr>
   </w:style>
@@ -696,11 +696,11 @@
       <w:outlineLvl w:val="1"/>
     </w:pPr>
     <w:rPr>
-      <w:rFonts w:asciiTheme="majorHAnsi" w:eastAsiaTheme="majorEastAsia" w:hAnsiTheme="majorHAnsi" w:cstheme="majorBidi" w:ascii="Noto Serif CJK SC" w:hAnsi="Noto Serif CJK SC" w:eastAsia="Noto Serif CJK SC"/>
+      <w:rFonts w:asciiTheme="majorHAnsi" w:eastAsiaTheme="majorEastAsia" w:hAnsiTheme="majorHAnsi" w:cstheme="majorBidi"/>
       <w:b/>
       <w:bCs/>
-      <w:color w:val="000000"/>
-      <w:sz w:val="22"/>
+      <w:color w:val="4F81BD" w:themeColor="accent1"/>
+      <w:sz w:val="26"/>
       <w:szCs w:val="26"/>
     </w:rPr>
   </w:style>
@@ -958,7 +958,7 @@
       <w:contextualSpacing/>
     </w:pPr>
     <w:rPr>
-      <w:rFonts w:asciiTheme="majorHAnsi" w:eastAsiaTheme="majorEastAsia" w:hAnsiTheme="majorHAnsi" w:cstheme="majorBidi" w:ascii="Noto Serif CJK SC" w:hAnsi="Noto Serif CJK SC" w:eastAsia="Noto Serif CJK SC"/>
+      <w:rFonts w:ascii="Arial Unicode MS" w:hAnsi="Arial Unicode MS" w:eastAsia="Arial Unicode MS" w:cs="Arial Unicode MS"/>
       <w:color w:val="000000"/>
       <w:spacing w:val="5"/>
       <w:kern w:val="28"/>

</xml_diff>